<commit_message>
FL-UX-2B MC answer submission API
</commit_message>
<xml_diff>
--- a/PHASE_LOG.docx
+++ b/PHASE_LOG.docx
@@ -2,7 +2,7 @@
 <file path=word/document.xml><?xml version="1.0" encoding="utf-8"?>
 <w:document xmlns:w="http://schemas.openxmlformats.org/wordprocessingml/2006/main" xmlns:m="http://schemas.openxmlformats.org/officeDocument/2006/math" xmlns:r="http://schemas.openxmlformats.org/officeDocument/2006/relationships" xmlns:o="urn:schemas-microsoft-com:office:office" xmlns:v="urn:schemas-microsoft-com:vml" xmlns:w10="urn:schemas-microsoft-com:office:word" xmlns:a="http://schemas.openxmlformats.org/drawingml/2006/main" xmlns:pic="http://schemas.openxmlformats.org/drawingml/2006/picture" xmlns:wp="http://schemas.openxmlformats.org/drawingml/2006/wordprocessingDrawing">
   <w:body>
-    <w:bookmarkStart w:id="188" w:name="X673ca0ebde876d6c5b49185f97aec29cf8c2b02"/>
+    <w:bookmarkStart w:id="200" w:name="X673ca0ebde876d6c5b49185f97aec29cf8c2b02"/>
     <w:p>
       <w:pPr>
         <w:pStyle w:val="Heading1"/>
@@ -26979,9 +26979,1509 @@
         <w:t xml:space="preserve">FL-UX-2B — Implement MC answer submission endpoint (after go/no-go gate satisfied)</w:t>
       </w:r>
     </w:p>
+    <w:p>
+      <w:r>
+        <w:pict>
+          <v:rect style="width:0;height:1.5pt" o:hralign="center" o:hrstd="t" o:hr="t"/>
+        </w:pict>
+      </w:r>
+    </w:p>
     <w:bookmarkEnd w:id="186"/>
     <w:bookmarkEnd w:id="187"/>
+    <w:bookmarkStart w:id="199" w:name="Xa91495448613830a2760965b3288ce30f2fb831"/>
+    <w:p>
+      <w:pPr>
+        <w:pStyle w:val="Heading2"/>
+      </w:pPr>
+      <w:r>
+        <w:t xml:space="preserve">FL-UX-2B — Backend API for multiple-choice answer submission</w:t>
+      </w:r>
+    </w:p>
+    <w:p>
+      <w:pPr>
+        <w:pStyle w:val="FirstParagraph"/>
+      </w:pPr>
+      <w:r>
+        <w:rPr>
+          <w:bCs/>
+          <w:b/>
+        </w:rPr>
+        <w:t xml:space="preserve">Date:</w:t>
+      </w:r>
+      <w:r>
+        <w:t xml:space="preserve"> </w:t>
+      </w:r>
+      <w:r>
+        <w:t xml:space="preserve">2026-04-30</w:t>
+      </w:r>
+    </w:p>
+    <w:bookmarkStart w:id="188" w:name="endpoint-added"/>
+    <w:p>
+      <w:pPr>
+        <w:pStyle w:val="Heading3"/>
+      </w:pPr>
+      <w:r>
+        <w:t xml:space="preserve">Endpoint added</w:t>
+      </w:r>
+    </w:p>
+    <w:p>
+      <w:pPr>
+        <w:numPr>
+          <w:ilvl w:val="0"/>
+          <w:numId w:val="1119"/>
+        </w:numPr>
+        <w:pStyle w:val="Compact"/>
+      </w:pPr>
+      <w:r>
+        <w:rPr>
+          <w:rStyle w:val="VerbatimChar"/>
+        </w:rPr>
+        <w:t xml:space="preserve">POST /api/study-loads/[id]/responses</w:t>
+      </w:r>
+      <w:r>
+        <w:t xml:space="preserve"> </w:t>
+      </w:r>
+      <w:r>
+        <w:t xml:space="preserve">— Creates or replaces one</w:t>
+      </w:r>
+      <w:r>
+        <w:t xml:space="preserve"> </w:t>
+      </w:r>
+      <w:r>
+        <w:rPr>
+          <w:rStyle w:val="VerbatimChar"/>
+        </w:rPr>
+        <w:t xml:space="preserve">mc_submission</w:t>
+      </w:r>
+      <w:r>
+        <w:t xml:space="preserve"> </w:t>
+      </w:r>
+      <w:r>
+        <w:t xml:space="preserve">Response for the active in-progress TutoringSession of a StudyLoad.</w:t>
+      </w:r>
+    </w:p>
     <w:bookmarkEnd w:id="188"/>
+    <w:bookmarkStart w:id="189" w:name="architecture"/>
+    <w:p>
+      <w:pPr>
+        <w:pStyle w:val="Heading3"/>
+      </w:pPr>
+      <w:r>
+        <w:t xml:space="preserve">Architecture</w:t>
+      </w:r>
+    </w:p>
+    <w:p>
+      <w:pPr>
+        <w:numPr>
+          <w:ilvl w:val="0"/>
+          <w:numId w:val="1120"/>
+        </w:numPr>
+        <w:pStyle w:val="Compact"/>
+      </w:pPr>
+      <w:r>
+        <w:t xml:space="preserve">JSON-in-Response approach: structured payload stored in</w:t>
+      </w:r>
+      <w:r>
+        <w:t xml:space="preserve"> </w:t>
+      </w:r>
+      <w:r>
+        <w:rPr>
+          <w:rStyle w:val="VerbatimChar"/>
+        </w:rPr>
+        <w:t xml:space="preserve">Response.content</w:t>
+      </w:r>
+      <w:r>
+        <w:t xml:space="preserve"> </w:t>
+      </w:r>
+      <w:r>
+        <w:t xml:space="preserve">with</w:t>
+      </w:r>
+      <w:r>
+        <w:t xml:space="preserve"> </w:t>
+      </w:r>
+      <w:r>
+        <w:rPr>
+          <w:rStyle w:val="VerbatimChar"/>
+        </w:rPr>
+        <w:t xml:space="preserve">responseType="mc_submission"</w:t>
+      </w:r>
+      <w:r>
+        <w:t xml:space="preserve">.</w:t>
+      </w:r>
+    </w:p>
+    <w:p>
+      <w:pPr>
+        <w:numPr>
+          <w:ilvl w:val="0"/>
+          <w:numId w:val="1120"/>
+        </w:numPr>
+        <w:pStyle w:val="Compact"/>
+      </w:pPr>
+      <w:r>
+        <w:t xml:space="preserve">Stored payload shape:</w:t>
+      </w:r>
+      <w:r>
+        <w:t xml:space="preserve"> </w:t>
+      </w:r>
+      <w:r>
+        <w:rPr>
+          <w:rStyle w:val="VerbatimChar"/>
+        </w:rPr>
+        <w:t xml:space="preserve">{ kind, schemaVersion, contentKey, contentVersion, studyLoadId, submittedAt, answers[], summary }</w:t>
+      </w:r>
+      <w:r>
+        <w:t xml:space="preserve">.</w:t>
+      </w:r>
+    </w:p>
+    <w:p>
+      <w:pPr>
+        <w:numPr>
+          <w:ilvl w:val="0"/>
+          <w:numId w:val="1120"/>
+        </w:numPr>
+        <w:pStyle w:val="Compact"/>
+      </w:pPr>
+      <w:r>
+        <w:t xml:space="preserve">Each answer includes</w:t>
+      </w:r>
+      <w:r>
+        <w:t xml:space="preserve"> </w:t>
+      </w:r>
+      <w:r>
+        <w:rPr>
+          <w:rStyle w:val="VerbatimChar"/>
+        </w:rPr>
+        <w:t xml:space="preserve">itemKey</w:t>
+      </w:r>
+      <w:r>
+        <w:t xml:space="preserve">,</w:t>
+      </w:r>
+      <w:r>
+        <w:t xml:space="preserve"> </w:t>
+      </w:r>
+      <w:r>
+        <w:rPr>
+          <w:rStyle w:val="VerbatimChar"/>
+        </w:rPr>
+        <w:t xml:space="preserve">selectedOptionKey</w:t>
+      </w:r>
+      <w:r>
+        <w:t xml:space="preserve">, and optionally</w:t>
+      </w:r>
+      <w:r>
+        <w:t xml:space="preserve"> </w:t>
+      </w:r>
+      <w:r>
+        <w:rPr>
+          <w:rStyle w:val="VerbatimChar"/>
+        </w:rPr>
+        <w:t xml:space="preserve">correctOptionKey</w:t>
+      </w:r>
+      <w:r>
+        <w:t xml:space="preserve">/</w:t>
+      </w:r>
+      <w:r>
+        <w:rPr>
+          <w:rStyle w:val="VerbatimChar"/>
+        </w:rPr>
+        <w:t xml:space="preserve">isCorrect</w:t>
+      </w:r>
+      <w:r>
+        <w:t xml:space="preserve"> </w:t>
+      </w:r>
+      <w:r>
+        <w:t xml:space="preserve">(when answer key available).</w:t>
+      </w:r>
+    </w:p>
+    <w:p>
+      <w:pPr>
+        <w:numPr>
+          <w:ilvl w:val="0"/>
+          <w:numId w:val="1120"/>
+        </w:numPr>
+        <w:pStyle w:val="Compact"/>
+      </w:pPr>
+      <w:r>
+        <w:t xml:space="preserve">Summary includes</w:t>
+      </w:r>
+      <w:r>
+        <w:t xml:space="preserve"> </w:t>
+      </w:r>
+      <w:r>
+        <w:rPr>
+          <w:rStyle w:val="VerbatimChar"/>
+        </w:rPr>
+        <w:t xml:space="preserve">answeredCount</w:t>
+      </w:r>
+      <w:r>
+        <w:t xml:space="preserve">,</w:t>
+      </w:r>
+      <w:r>
+        <w:t xml:space="preserve"> </w:t>
+      </w:r>
+      <w:r>
+        <w:rPr>
+          <w:rStyle w:val="VerbatimChar"/>
+        </w:rPr>
+        <w:t xml:space="preserve">totalItemCount</w:t>
+      </w:r>
+      <w:r>
+        <w:t xml:space="preserve">,</w:t>
+      </w:r>
+      <w:r>
+        <w:t xml:space="preserve"> </w:t>
+      </w:r>
+      <w:r>
+        <w:rPr>
+          <w:rStyle w:val="VerbatimChar"/>
+        </w:rPr>
+        <w:t xml:space="preserve">correctCount</w:t>
+      </w:r>
+      <w:r>
+        <w:t xml:space="preserve">,</w:t>
+      </w:r>
+      <w:r>
+        <w:t xml:space="preserve"> </w:t>
+      </w:r>
+      <w:r>
+        <w:rPr>
+          <w:rStyle w:val="VerbatimChar"/>
+        </w:rPr>
+        <w:t xml:space="preserve">hasAnswerKey</w:t>
+      </w:r>
+      <w:r>
+        <w:t xml:space="preserve">.</w:t>
+      </w:r>
+    </w:p>
+    <w:bookmarkEnd w:id="189"/>
+    <w:bookmarkStart w:id="190" w:name="content-registry-updated"/>
+    <w:p>
+      <w:pPr>
+        <w:pStyle w:val="Heading3"/>
+      </w:pPr>
+      <w:r>
+        <w:t xml:space="preserve">Content registry updated</w:t>
+      </w:r>
+    </w:p>
+    <w:p>
+      <w:pPr>
+        <w:numPr>
+          <w:ilvl w:val="0"/>
+          <w:numId w:val="1121"/>
+        </w:numPr>
+        <w:pStyle w:val="Compact"/>
+      </w:pPr>
+      <w:r>
+        <w:rPr>
+          <w:rStyle w:val="VerbatimChar"/>
+        </w:rPr>
+        <w:t xml:space="preserve">lib/study-load-content.ts</w:t>
+      </w:r>
+      <w:r>
+        <w:t xml:space="preserve"> </w:t>
+      </w:r>
+      <w:r>
+        <w:t xml:space="preserve">— Added</w:t>
+      </w:r>
+      <w:r>
+        <w:t xml:space="preserve"> </w:t>
+      </w:r>
+      <w:r>
+        <w:rPr>
+          <w:rStyle w:val="VerbatimChar"/>
+        </w:rPr>
+        <w:t xml:space="preserve">contentKey</w:t>
+      </w:r>
+      <w:r>
+        <w:t xml:space="preserve">,</w:t>
+      </w:r>
+      <w:r>
+        <w:t xml:space="preserve"> </w:t>
+      </w:r>
+      <w:r>
+        <w:rPr>
+          <w:rStyle w:val="VerbatimChar"/>
+        </w:rPr>
+        <w:t xml:space="preserve">contentVersion</w:t>
+      </w:r>
+      <w:r>
+        <w:t xml:space="preserve">,</w:t>
+      </w:r>
+      <w:r>
+        <w:t xml:space="preserve"> </w:t>
+      </w:r>
+      <w:r>
+        <w:rPr>
+          <w:rStyle w:val="VerbatimChar"/>
+        </w:rPr>
+        <w:t xml:space="preserve">key</w:t>
+      </w:r>
+      <w:r>
+        <w:t xml:space="preserve"> </w:t>
+      </w:r>
+      <w:r>
+        <w:t xml:space="preserve">(item identifier),</w:t>
+      </w:r>
+      <w:r>
+        <w:t xml:space="preserve"> </w:t>
+      </w:r>
+      <w:r>
+        <w:rPr>
+          <w:rStyle w:val="VerbatimChar"/>
+        </w:rPr>
+        <w:t xml:space="preserve">correctOptionKey</w:t>
+      </w:r>
+      <w:r>
+        <w:t xml:space="preserve"> </w:t>
+      </w:r>
+      <w:r>
+        <w:t xml:space="preserve">fields.</w:t>
+      </w:r>
+    </w:p>
+    <w:p>
+      <w:pPr>
+        <w:numPr>
+          <w:ilvl w:val="0"/>
+          <w:numId w:val="1121"/>
+        </w:numPr>
+        <w:pStyle w:val="Compact"/>
+      </w:pPr>
+      <w:r>
+        <w:t xml:space="preserve">Added</w:t>
+      </w:r>
+      <w:r>
+        <w:t xml:space="preserve"> </w:t>
+      </w:r>
+      <w:r>
+        <w:rPr>
+          <w:rStyle w:val="VerbatimChar"/>
+        </w:rPr>
+        <w:t xml:space="preserve">getStudyLoadContentByKey()</w:t>
+      </w:r>
+      <w:r>
+        <w:t xml:space="preserve"> </w:t>
+      </w:r>
+      <w:r>
+        <w:t xml:space="preserve">lookup function.</w:t>
+      </w:r>
+    </w:p>
+    <w:p>
+      <w:pPr>
+        <w:numPr>
+          <w:ilvl w:val="0"/>
+          <w:numId w:val="1121"/>
+        </w:numPr>
+        <w:pStyle w:val="Compact"/>
+      </w:pPr>
+      <w:r>
+        <w:t xml:space="preserve">Both existing content entries (basic + word problems) enriched with stable keys and answer keys.</w:t>
+      </w:r>
+    </w:p>
+    <w:p>
+      <w:pPr>
+        <w:numPr>
+          <w:ilvl w:val="0"/>
+          <w:numId w:val="1121"/>
+        </w:numPr>
+        <w:pStyle w:val="Compact"/>
+      </w:pPr>
+      <w:r>
+        <w:t xml:space="preserve">Backward-compatible: existing viewer unchanged (uses</w:t>
+      </w:r>
+      <w:r>
+        <w:t xml:space="preserve"> </w:t>
+      </w:r>
+      <w:r>
+        <w:rPr>
+          <w:rStyle w:val="VerbatimChar"/>
+        </w:rPr>
+        <w:t xml:space="preserve">title</w:t>
+      </w:r>
+      <w:r>
+        <w:t xml:space="preserve"> </w:t>
+      </w:r>
+      <w:r>
+        <w:t xml:space="preserve">lookup and</w:t>
+      </w:r>
+      <w:r>
+        <w:t xml:space="preserve"> </w:t>
+      </w:r>
+      <w:r>
+        <w:rPr>
+          <w:rStyle w:val="VerbatimChar"/>
+        </w:rPr>
+        <w:t xml:space="preserve">stem</w:t>
+      </w:r>
+      <w:r>
+        <w:t xml:space="preserve">/</w:t>
+      </w:r>
+      <w:r>
+        <w:rPr>
+          <w:rStyle w:val="VerbatimChar"/>
+        </w:rPr>
+        <w:t xml:space="preserve">options</w:t>
+      </w:r>
+      <w:r>
+        <w:t xml:space="preserve">).</w:t>
+      </w:r>
+    </w:p>
+    <w:bookmarkEnd w:id="190"/>
+    <w:bookmarkStart w:id="191" w:name="validation-implemented"/>
+    <w:p>
+      <w:pPr>
+        <w:pStyle w:val="Heading3"/>
+      </w:pPr>
+      <w:r>
+        <w:t xml:space="preserve">Validation implemented</w:t>
+      </w:r>
+    </w:p>
+    <w:p>
+      <w:pPr>
+        <w:numPr>
+          <w:ilvl w:val="0"/>
+          <w:numId w:val="1122"/>
+        </w:numPr>
+        <w:pStyle w:val="Compact"/>
+      </w:pPr>
+      <w:r>
+        <w:t xml:space="preserve">Authenticated user (401)</w:t>
+      </w:r>
+    </w:p>
+    <w:p>
+      <w:pPr>
+        <w:numPr>
+          <w:ilvl w:val="0"/>
+          <w:numId w:val="1122"/>
+        </w:numPr>
+        <w:pStyle w:val="Compact"/>
+      </w:pPr>
+      <w:r>
+        <w:t xml:space="preserve">Ownership: User.email → Student.email → active Enrollment → open Cycle → StudyLoad (403)</w:t>
+      </w:r>
+    </w:p>
+    <w:p>
+      <w:pPr>
+        <w:numPr>
+          <w:ilvl w:val="0"/>
+          <w:numId w:val="1122"/>
+        </w:numPr>
+        <w:pStyle w:val="Compact"/>
+      </w:pPr>
+      <w:r>
+        <w:t xml:space="preserve">Enrollment active (409)</w:t>
+      </w:r>
+    </w:p>
+    <w:p>
+      <w:pPr>
+        <w:numPr>
+          <w:ilvl w:val="0"/>
+          <w:numId w:val="1122"/>
+        </w:numPr>
+        <w:pStyle w:val="Compact"/>
+      </w:pPr>
+      <w:r>
+        <w:t xml:space="preserve">Cycle open (409)</w:t>
+      </w:r>
+    </w:p>
+    <w:p>
+      <w:pPr>
+        <w:numPr>
+          <w:ilvl w:val="0"/>
+          <w:numId w:val="1122"/>
+        </w:numPr>
+        <w:pStyle w:val="Compact"/>
+      </w:pPr>
+      <w:r>
+        <w:t xml:space="preserve">StudyLoad in_progress required (409); completed loads rejected (409)</w:t>
+      </w:r>
+    </w:p>
+    <w:p>
+      <w:pPr>
+        <w:numPr>
+          <w:ilvl w:val="0"/>
+          <w:numId w:val="1122"/>
+        </w:numPr>
+        <w:pStyle w:val="Compact"/>
+      </w:pPr>
+      <w:r>
+        <w:t xml:space="preserve">Content registry lookup by title (400 if no content)</w:t>
+      </w:r>
+    </w:p>
+    <w:p>
+      <w:pPr>
+        <w:numPr>
+          <w:ilvl w:val="0"/>
+          <w:numId w:val="1122"/>
+        </w:numPr>
+        <w:pStyle w:val="Compact"/>
+      </w:pPr>
+      <w:r>
+        <w:rPr>
+          <w:rStyle w:val="VerbatimChar"/>
+        </w:rPr>
+        <w:t xml:space="preserve">contentKey</w:t>
+      </w:r>
+      <w:r>
+        <w:t xml:space="preserve"> </w:t>
+      </w:r>
+      <w:r>
+        <w:t xml:space="preserve">and</w:t>
+      </w:r>
+      <w:r>
+        <w:t xml:space="preserve"> </w:t>
+      </w:r>
+      <w:r>
+        <w:rPr>
+          <w:rStyle w:val="VerbatimChar"/>
+        </w:rPr>
+        <w:t xml:space="preserve">contentVersion</w:t>
+      </w:r>
+      <w:r>
+        <w:t xml:space="preserve"> </w:t>
+      </w:r>
+      <w:r>
+        <w:t xml:space="preserve">must match registered content for this load (400)</w:t>
+      </w:r>
+    </w:p>
+    <w:p>
+      <w:pPr>
+        <w:numPr>
+          <w:ilvl w:val="0"/>
+          <w:numId w:val="1122"/>
+        </w:numPr>
+        <w:pStyle w:val="Compact"/>
+      </w:pPr>
+      <w:r>
+        <w:t xml:space="preserve">Each</w:t>
+      </w:r>
+      <w:r>
+        <w:t xml:space="preserve"> </w:t>
+      </w:r>
+      <w:r>
+        <w:rPr>
+          <w:rStyle w:val="VerbatimChar"/>
+        </w:rPr>
+        <w:t xml:space="preserve">itemKey</w:t>
+      </w:r>
+      <w:r>
+        <w:t xml:space="preserve"> </w:t>
+      </w:r>
+      <w:r>
+        <w:t xml:space="preserve">must exist in content (400)</w:t>
+      </w:r>
+    </w:p>
+    <w:p>
+      <w:pPr>
+        <w:numPr>
+          <w:ilvl w:val="0"/>
+          <w:numId w:val="1122"/>
+        </w:numPr>
+        <w:pStyle w:val="Compact"/>
+      </w:pPr>
+      <w:r>
+        <w:t xml:space="preserve">Each</w:t>
+      </w:r>
+      <w:r>
+        <w:t xml:space="preserve"> </w:t>
+      </w:r>
+      <w:r>
+        <w:rPr>
+          <w:rStyle w:val="VerbatimChar"/>
+        </w:rPr>
+        <w:t xml:space="preserve">selectedOptionKey</w:t>
+      </w:r>
+      <w:r>
+        <w:t xml:space="preserve"> </w:t>
+      </w:r>
+      <w:r>
+        <w:t xml:space="preserve">must be a valid option label for that item (400)</w:t>
+      </w:r>
+    </w:p>
+    <w:p>
+      <w:pPr>
+        <w:numPr>
+          <w:ilvl w:val="0"/>
+          <w:numId w:val="1122"/>
+        </w:numPr>
+        <w:pStyle w:val="Compact"/>
+      </w:pPr>
+      <w:r>
+        <w:t xml:space="preserve">Duplicate</w:t>
+      </w:r>
+      <w:r>
+        <w:t xml:space="preserve"> </w:t>
+      </w:r>
+      <w:r>
+        <w:rPr>
+          <w:rStyle w:val="VerbatimChar"/>
+        </w:rPr>
+        <w:t xml:space="preserve">itemKey</w:t>
+      </w:r>
+      <w:r>
+        <w:t xml:space="preserve"> </w:t>
+      </w:r>
+      <w:r>
+        <w:t xml:space="preserve">entries rejected (400)</w:t>
+      </w:r>
+    </w:p>
+    <w:p>
+      <w:pPr>
+        <w:numPr>
+          <w:ilvl w:val="0"/>
+          <w:numId w:val="1122"/>
+        </w:numPr>
+        <w:pStyle w:val="Compact"/>
+      </w:pPr>
+      <w:r>
+        <w:t xml:space="preserve">Empty answers array rejected (400)</w:t>
+      </w:r>
+    </w:p>
+    <w:p>
+      <w:pPr>
+        <w:numPr>
+          <w:ilvl w:val="0"/>
+          <w:numId w:val="1122"/>
+        </w:numPr>
+        <w:pStyle w:val="Compact"/>
+      </w:pPr>
+      <w:r>
+        <w:t xml:space="preserve">Active TutoringSession must exist (409)</w:t>
+      </w:r>
+    </w:p>
+    <w:bookmarkEnd w:id="191"/>
+    <w:bookmarkStart w:id="192" w:name="submission-rules"/>
+    <w:p>
+      <w:pPr>
+        <w:pStyle w:val="Heading3"/>
+      </w:pPr>
+      <w:r>
+        <w:t xml:space="preserve">Submission rules</w:t>
+      </w:r>
+    </w:p>
+    <w:p>
+      <w:pPr>
+        <w:numPr>
+          <w:ilvl w:val="0"/>
+          <w:numId w:val="1123"/>
+        </w:numPr>
+        <w:pStyle w:val="Compact"/>
+      </w:pPr>
+      <w:r>
+        <w:t xml:space="preserve">At most one</w:t>
+      </w:r>
+      <w:r>
+        <w:t xml:space="preserve"> </w:t>
+      </w:r>
+      <w:r>
+        <w:rPr>
+          <w:rStyle w:val="VerbatimChar"/>
+        </w:rPr>
+        <w:t xml:space="preserve">mc_submission</w:t>
+      </w:r>
+      <w:r>
+        <w:t xml:space="preserve"> </w:t>
+      </w:r>
+      <w:r>
+        <w:t xml:space="preserve">Response per TutoringSession.</w:t>
+      </w:r>
+    </w:p>
+    <w:p>
+      <w:pPr>
+        <w:numPr>
+          <w:ilvl w:val="0"/>
+          <w:numId w:val="1123"/>
+        </w:numPr>
+        <w:pStyle w:val="Compact"/>
+      </w:pPr>
+      <w:r>
+        <w:t xml:space="preserve">Resubmission while</w:t>
+      </w:r>
+      <w:r>
+        <w:t xml:space="preserve"> </w:t>
+      </w:r>
+      <w:r>
+        <w:rPr>
+          <w:rStyle w:val="VerbatimChar"/>
+        </w:rPr>
+        <w:t xml:space="preserve">in_progress</w:t>
+      </w:r>
+      <w:r>
+        <w:t xml:space="preserve"> </w:t>
+      </w:r>
+      <w:r>
+        <w:t xml:space="preserve">replaces the existing</w:t>
+      </w:r>
+      <w:r>
+        <w:t xml:space="preserve"> </w:t>
+      </w:r>
+      <w:r>
+        <w:rPr>
+          <w:rStyle w:val="VerbatimChar"/>
+        </w:rPr>
+        <w:t xml:space="preserve">mc_submission</w:t>
+      </w:r>
+      <w:r>
+        <w:t xml:space="preserve"> </w:t>
+      </w:r>
+      <w:r>
+        <w:t xml:space="preserve">(update, returns 200).</w:t>
+      </w:r>
+    </w:p>
+    <w:p>
+      <w:pPr>
+        <w:numPr>
+          <w:ilvl w:val="0"/>
+          <w:numId w:val="1123"/>
+        </w:numPr>
+        <w:pStyle w:val="Compact"/>
+      </w:pPr>
+      <w:r>
+        <w:t xml:space="preserve">First submission creates new Response (returns 201).</w:t>
+      </w:r>
+    </w:p>
+    <w:p>
+      <w:pPr>
+        <w:numPr>
+          <w:ilvl w:val="0"/>
+          <w:numId w:val="1123"/>
+        </w:numPr>
+        <w:pStyle w:val="Compact"/>
+      </w:pPr>
+      <w:r>
+        <w:t xml:space="preserve">Completed StudyLoad rejects modification (409).</w:t>
+      </w:r>
+    </w:p>
+    <w:bookmarkEnd w:id="192"/>
+    <w:bookmarkStart w:id="193" w:name="response-shape"/>
+    <w:p>
+      <w:pPr>
+        <w:pStyle w:val="Heading3"/>
+      </w:pPr>
+      <w:r>
+        <w:t xml:space="preserve">Response shape</w:t>
+      </w:r>
+    </w:p>
+    <w:p>
+      <w:pPr>
+        <w:pStyle w:val="SourceCode"/>
+      </w:pPr>
+      <w:r>
+        <w:rPr>
+          <w:rStyle w:val="FunctionTok"/>
+        </w:rPr>
+        <w:t xml:space="preserve">{</w:t>
+      </w:r>
+      <w:r>
+        <w:br/>
+      </w:r>
+      <w:r>
+        <w:rPr>
+          <w:rStyle w:val="NormalTok"/>
+        </w:rPr>
+        <w:t xml:space="preserve">  </w:t>
+      </w:r>
+      <w:r>
+        <w:rPr>
+          <w:rStyle w:val="DataTypeTok"/>
+        </w:rPr>
+        <w:t xml:space="preserve">"ok"</w:t>
+      </w:r>
+      <w:r>
+        <w:rPr>
+          <w:rStyle w:val="FunctionTok"/>
+        </w:rPr>
+        <w:t xml:space="preserve">:</w:t>
+      </w:r>
+      <w:r>
+        <w:rPr>
+          <w:rStyle w:val="NormalTok"/>
+        </w:rPr>
+        <w:t xml:space="preserve"> </w:t>
+      </w:r>
+      <w:r>
+        <w:rPr>
+          <w:rStyle w:val="KeywordTok"/>
+        </w:rPr>
+        <w:t xml:space="preserve">true</w:t>
+      </w:r>
+      <w:r>
+        <w:rPr>
+          <w:rStyle w:val="FunctionTok"/>
+        </w:rPr>
+        <w:t xml:space="preserve">,</w:t>
+      </w:r>
+      <w:r>
+        <w:br/>
+      </w:r>
+      <w:r>
+        <w:rPr>
+          <w:rStyle w:val="NormalTok"/>
+        </w:rPr>
+        <w:t xml:space="preserve">  </w:t>
+      </w:r>
+      <w:r>
+        <w:rPr>
+          <w:rStyle w:val="DataTypeTok"/>
+        </w:rPr>
+        <w:t xml:space="preserve">"responseType"</w:t>
+      </w:r>
+      <w:r>
+        <w:rPr>
+          <w:rStyle w:val="FunctionTok"/>
+        </w:rPr>
+        <w:t xml:space="preserve">:</w:t>
+      </w:r>
+      <w:r>
+        <w:rPr>
+          <w:rStyle w:val="NormalTok"/>
+        </w:rPr>
+        <w:t xml:space="preserve"> </w:t>
+      </w:r>
+      <w:r>
+        <w:rPr>
+          <w:rStyle w:val="StringTok"/>
+        </w:rPr>
+        <w:t xml:space="preserve">"mc_submission"</w:t>
+      </w:r>
+      <w:r>
+        <w:rPr>
+          <w:rStyle w:val="FunctionTok"/>
+        </w:rPr>
+        <w:t xml:space="preserve">,</w:t>
+      </w:r>
+      <w:r>
+        <w:br/>
+      </w:r>
+      <w:r>
+        <w:rPr>
+          <w:rStyle w:val="NormalTok"/>
+        </w:rPr>
+        <w:t xml:space="preserve">  </w:t>
+      </w:r>
+      <w:r>
+        <w:rPr>
+          <w:rStyle w:val="DataTypeTok"/>
+        </w:rPr>
+        <w:t xml:space="preserve">"studyLoadId"</w:t>
+      </w:r>
+      <w:r>
+        <w:rPr>
+          <w:rStyle w:val="FunctionTok"/>
+        </w:rPr>
+        <w:t xml:space="preserve">:</w:t>
+      </w:r>
+      <w:r>
+        <w:rPr>
+          <w:rStyle w:val="NormalTok"/>
+        </w:rPr>
+        <w:t xml:space="preserve"> </w:t>
+      </w:r>
+      <w:r>
+        <w:rPr>
+          <w:rStyle w:val="StringTok"/>
+        </w:rPr>
+        <w:t xml:space="preserve">"..."</w:t>
+      </w:r>
+      <w:r>
+        <w:rPr>
+          <w:rStyle w:val="FunctionTok"/>
+        </w:rPr>
+        <w:t xml:space="preserve">,</w:t>
+      </w:r>
+      <w:r>
+        <w:br/>
+      </w:r>
+      <w:r>
+        <w:rPr>
+          <w:rStyle w:val="NormalTok"/>
+        </w:rPr>
+        <w:t xml:space="preserve">  </w:t>
+      </w:r>
+      <w:r>
+        <w:rPr>
+          <w:rStyle w:val="DataTypeTok"/>
+        </w:rPr>
+        <w:t xml:space="preserve">"answeredCount"</w:t>
+      </w:r>
+      <w:r>
+        <w:rPr>
+          <w:rStyle w:val="FunctionTok"/>
+        </w:rPr>
+        <w:t xml:space="preserve">:</w:t>
+      </w:r>
+      <w:r>
+        <w:rPr>
+          <w:rStyle w:val="NormalTok"/>
+        </w:rPr>
+        <w:t xml:space="preserve"> </w:t>
+      </w:r>
+      <w:r>
+        <w:rPr>
+          <w:rStyle w:val="DecValTok"/>
+        </w:rPr>
+        <w:t xml:space="preserve">2</w:t>
+      </w:r>
+      <w:r>
+        <w:rPr>
+          <w:rStyle w:val="FunctionTok"/>
+        </w:rPr>
+        <w:t xml:space="preserve">,</w:t>
+      </w:r>
+      <w:r>
+        <w:br/>
+      </w:r>
+      <w:r>
+        <w:rPr>
+          <w:rStyle w:val="NormalTok"/>
+        </w:rPr>
+        <w:t xml:space="preserve">  </w:t>
+      </w:r>
+      <w:r>
+        <w:rPr>
+          <w:rStyle w:val="DataTypeTok"/>
+        </w:rPr>
+        <w:t xml:space="preserve">"totalItemCount"</w:t>
+      </w:r>
+      <w:r>
+        <w:rPr>
+          <w:rStyle w:val="FunctionTok"/>
+        </w:rPr>
+        <w:t xml:space="preserve">:</w:t>
+      </w:r>
+      <w:r>
+        <w:rPr>
+          <w:rStyle w:val="NormalTok"/>
+        </w:rPr>
+        <w:t xml:space="preserve"> </w:t>
+      </w:r>
+      <w:r>
+        <w:rPr>
+          <w:rStyle w:val="DecValTok"/>
+        </w:rPr>
+        <w:t xml:space="preserve">8</w:t>
+      </w:r>
+      <w:r>
+        <w:rPr>
+          <w:rStyle w:val="FunctionTok"/>
+        </w:rPr>
+        <w:t xml:space="preserve">,</w:t>
+      </w:r>
+      <w:r>
+        <w:br/>
+      </w:r>
+      <w:r>
+        <w:rPr>
+          <w:rStyle w:val="NormalTok"/>
+        </w:rPr>
+        <w:t xml:space="preserve">  </w:t>
+      </w:r>
+      <w:r>
+        <w:rPr>
+          <w:rStyle w:val="DataTypeTok"/>
+        </w:rPr>
+        <w:t xml:space="preserve">"correctCount"</w:t>
+      </w:r>
+      <w:r>
+        <w:rPr>
+          <w:rStyle w:val="FunctionTok"/>
+        </w:rPr>
+        <w:t xml:space="preserve">:</w:t>
+      </w:r>
+      <w:r>
+        <w:rPr>
+          <w:rStyle w:val="NormalTok"/>
+        </w:rPr>
+        <w:t xml:space="preserve"> </w:t>
+      </w:r>
+      <w:r>
+        <w:rPr>
+          <w:rStyle w:val="DecValTok"/>
+        </w:rPr>
+        <w:t xml:space="preserve">1</w:t>
+      </w:r>
+      <w:r>
+        <w:rPr>
+          <w:rStyle w:val="FunctionTok"/>
+        </w:rPr>
+        <w:t xml:space="preserve">,</w:t>
+      </w:r>
+      <w:r>
+        <w:br/>
+      </w:r>
+      <w:r>
+        <w:rPr>
+          <w:rStyle w:val="NormalTok"/>
+        </w:rPr>
+        <w:t xml:space="preserve">  </w:t>
+      </w:r>
+      <w:r>
+        <w:rPr>
+          <w:rStyle w:val="DataTypeTok"/>
+        </w:rPr>
+        <w:t xml:space="preserve">"hasAnswerKey"</w:t>
+      </w:r>
+      <w:r>
+        <w:rPr>
+          <w:rStyle w:val="FunctionTok"/>
+        </w:rPr>
+        <w:t xml:space="preserve">:</w:t>
+      </w:r>
+      <w:r>
+        <w:rPr>
+          <w:rStyle w:val="NormalTok"/>
+        </w:rPr>
+        <w:t xml:space="preserve"> </w:t>
+      </w:r>
+      <w:r>
+        <w:rPr>
+          <w:rStyle w:val="KeywordTok"/>
+        </w:rPr>
+        <w:t xml:space="preserve">true</w:t>
+      </w:r>
+      <w:r>
+        <w:br/>
+      </w:r>
+      <w:r>
+        <w:rPr>
+          <w:rStyle w:val="FunctionTok"/>
+        </w:rPr>
+        <w:t xml:space="preserve">}</w:t>
+      </w:r>
+    </w:p>
+    <w:bookmarkEnd w:id="193"/>
+    <w:bookmarkStart w:id="194" w:name="files-changed"/>
+    <w:p>
+      <w:pPr>
+        <w:pStyle w:val="Heading3"/>
+      </w:pPr>
+      <w:r>
+        <w:t xml:space="preserve">Files changed</w:t>
+      </w:r>
+    </w:p>
+    <w:p>
+      <w:pPr>
+        <w:numPr>
+          <w:ilvl w:val="0"/>
+          <w:numId w:val="1124"/>
+        </w:numPr>
+        <w:pStyle w:val="Compact"/>
+      </w:pPr>
+      <w:r>
+        <w:rPr>
+          <w:rStyle w:val="VerbatimChar"/>
+        </w:rPr>
+        <w:t xml:space="preserve">nextjs_space/lib/study-load-content.ts</w:t>
+      </w:r>
+      <w:r>
+        <w:t xml:space="preserve"> </w:t>
+      </w:r>
+      <w:r>
+        <w:t xml:space="preserve">— Added contentKey, contentVersion, item keys, answer keys, getStudyLoadContentByKey.</w:t>
+      </w:r>
+    </w:p>
+    <w:p>
+      <w:pPr>
+        <w:numPr>
+          <w:ilvl w:val="0"/>
+          <w:numId w:val="1124"/>
+        </w:numPr>
+        <w:pStyle w:val="Compact"/>
+      </w:pPr>
+      <w:r>
+        <w:rPr>
+          <w:rStyle w:val="VerbatimChar"/>
+        </w:rPr>
+        <w:t xml:space="preserve">nextjs_space/app/api/study-loads/[id]/responses/route.ts</w:t>
+      </w:r>
+      <w:r>
+        <w:t xml:space="preserve"> </w:t>
+      </w:r>
+      <w:r>
+        <w:t xml:space="preserve">— New endpoint (POST only).</w:t>
+      </w:r>
+    </w:p>
+    <w:p>
+      <w:pPr>
+        <w:numPr>
+          <w:ilvl w:val="0"/>
+          <w:numId w:val="1124"/>
+        </w:numPr>
+        <w:pStyle w:val="Compact"/>
+      </w:pPr>
+      <w:r>
+        <w:rPr>
+          <w:rStyle w:val="VerbatimChar"/>
+        </w:rPr>
+        <w:t xml:space="preserve">PHASE_LOG.md</w:t>
+      </w:r>
+      <w:r>
+        <w:t xml:space="preserve"> </w:t>
+      </w:r>
+      <w:r>
+        <w:t xml:space="preserve">— This entry.</w:t>
+      </w:r>
+    </w:p>
+    <w:bookmarkEnd w:id="194"/>
+    <w:bookmarkStart w:id="195" w:name="what-was-not-done-12"/>
+    <w:p>
+      <w:pPr>
+        <w:pStyle w:val="Heading3"/>
+      </w:pPr>
+      <w:r>
+        <w:t xml:space="preserve">What was NOT done</w:t>
+      </w:r>
+    </w:p>
+    <w:p>
+      <w:pPr>
+        <w:numPr>
+          <w:ilvl w:val="0"/>
+          <w:numId w:val="1125"/>
+        </w:numPr>
+        <w:pStyle w:val="Compact"/>
+      </w:pPr>
+      <w:r>
+        <w:t xml:space="preserve">No Prisma schema changes</w:t>
+      </w:r>
+    </w:p>
+    <w:p>
+      <w:pPr>
+        <w:numPr>
+          <w:ilvl w:val="0"/>
+          <w:numId w:val="1125"/>
+        </w:numPr>
+        <w:pStyle w:val="Compact"/>
+      </w:pPr>
+      <w:r>
+        <w:t xml:space="preserve">No migrations, db push, or database reset</w:t>
+      </w:r>
+    </w:p>
+    <w:p>
+      <w:pPr>
+        <w:numPr>
+          <w:ilvl w:val="0"/>
+          <w:numId w:val="1125"/>
+        </w:numPr>
+        <w:pStyle w:val="Compact"/>
+      </w:pPr>
+      <w:r>
+        <w:t xml:space="preserve">No changes to</w:t>
+      </w:r>
+      <w:r>
+        <w:t xml:space="preserve"> </w:t>
+      </w:r>
+      <w:r>
+        <w:rPr>
+          <w:rStyle w:val="VerbatimChar"/>
+        </w:rPr>
+        <w:t xml:space="preserve">/start</w:t>
+      </w:r>
+      <w:r>
+        <w:t xml:space="preserve"> </w:t>
+      </w:r>
+      <w:r>
+        <w:t xml:space="preserve">or</w:t>
+      </w:r>
+      <w:r>
+        <w:t xml:space="preserve"> </w:t>
+      </w:r>
+      <w:r>
+        <w:rPr>
+          <w:rStyle w:val="VerbatimChar"/>
+        </w:rPr>
+        <w:t xml:space="preserve">/complete</w:t>
+      </w:r>
+      <w:r>
+        <w:t xml:space="preserve"> </w:t>
+      </w:r>
+      <w:r>
+        <w:t xml:space="preserve">endpoints</w:t>
+      </w:r>
+    </w:p>
+    <w:p>
+      <w:pPr>
+        <w:numPr>
+          <w:ilvl w:val="0"/>
+          <w:numId w:val="1125"/>
+        </w:numPr>
+        <w:pStyle w:val="Compact"/>
+      </w:pPr>
+      <w:r>
+        <w:t xml:space="preserve">No changes to StudyLoad.status or LearningCycle.status logic</w:t>
+      </w:r>
+    </w:p>
+    <w:p>
+      <w:pPr>
+        <w:numPr>
+          <w:ilvl w:val="0"/>
+          <w:numId w:val="1125"/>
+        </w:numPr>
+        <w:pStyle w:val="Compact"/>
+      </w:pPr>
+      <w:r>
+        <w:t xml:space="preserve">No CycleDecision, CycleEvaluation, or next StudyLoad creation</w:t>
+      </w:r>
+    </w:p>
+    <w:p>
+      <w:pPr>
+        <w:numPr>
+          <w:ilvl w:val="0"/>
+          <w:numId w:val="1125"/>
+        </w:numPr>
+        <w:pStyle w:val="Compact"/>
+      </w:pPr>
+      <w:r>
+        <w:t xml:space="preserve">No scoring, PAES score, or adaptive logic</w:t>
+      </w:r>
+    </w:p>
+    <w:p>
+      <w:pPr>
+        <w:numPr>
+          <w:ilvl w:val="0"/>
+          <w:numId w:val="1125"/>
+        </w:numPr>
+        <w:pStyle w:val="Compact"/>
+      </w:pPr>
+      <w:r>
+        <w:t xml:space="preserve">No student UI</w:t>
+      </w:r>
+    </w:p>
+    <w:p>
+      <w:pPr>
+        <w:numPr>
+          <w:ilvl w:val="0"/>
+          <w:numId w:val="1125"/>
+        </w:numPr>
+        <w:pStyle w:val="Compact"/>
+      </w:pPr>
+      <w:r>
+        <w:t xml:space="preserve">No admin evidence UI</w:t>
+      </w:r>
+    </w:p>
+    <w:p>
+      <w:pPr>
+        <w:numPr>
+          <w:ilvl w:val="0"/>
+          <w:numId w:val="1125"/>
+        </w:numPr>
+        <w:pStyle w:val="Compact"/>
+      </w:pPr>
+      <w:r>
+        <w:t xml:space="preserve">No AI/agents</w:t>
+      </w:r>
+    </w:p>
+    <w:p>
+      <w:pPr>
+        <w:numPr>
+          <w:ilvl w:val="0"/>
+          <w:numId w:val="1125"/>
+        </w:numPr>
+        <w:pStyle w:val="Compact"/>
+      </w:pPr>
+      <w:r>
+        <w:t xml:space="preserve">No deploy</w:t>
+      </w:r>
+    </w:p>
+    <w:p>
+      <w:pPr>
+        <w:numPr>
+          <w:ilvl w:val="0"/>
+          <w:numId w:val="1125"/>
+        </w:numPr>
+        <w:pStyle w:val="Compact"/>
+      </w:pPr>
+      <w:r>
+        <w:t xml:space="preserve">No .env changes</w:t>
+      </w:r>
+    </w:p>
+    <w:p>
+      <w:pPr>
+        <w:numPr>
+          <w:ilvl w:val="0"/>
+          <w:numId w:val="1125"/>
+        </w:numPr>
+        <w:pStyle w:val="Compact"/>
+      </w:pPr>
+      <w:r>
+        <w:t xml:space="preserve">No secrets printed</w:t>
+      </w:r>
+    </w:p>
+    <w:p>
+      <w:pPr>
+        <w:numPr>
+          <w:ilvl w:val="0"/>
+          <w:numId w:val="1125"/>
+        </w:numPr>
+        <w:pStyle w:val="Compact"/>
+      </w:pPr>
+      <w:r>
+        <w:t xml:space="preserve">No production data mutated</w:t>
+      </w:r>
+    </w:p>
+    <w:bookmarkEnd w:id="195"/>
+    <w:bookmarkStart w:id="196" w:name="verification-2"/>
+    <w:p>
+      <w:pPr>
+        <w:pStyle w:val="Heading3"/>
+      </w:pPr>
+      <w:r>
+        <w:t xml:space="preserve">Verification</w:t>
+      </w:r>
+    </w:p>
+    <w:p>
+      <w:pPr>
+        <w:numPr>
+          <w:ilvl w:val="0"/>
+          <w:numId w:val="1126"/>
+        </w:numPr>
+        <w:pStyle w:val="Compact"/>
+      </w:pPr>
+      <w:r>
+        <w:t xml:space="preserve">TypeScript check: passed (0 errors)</w:t>
+      </w:r>
+    </w:p>
+    <w:p>
+      <w:pPr>
+        <w:numPr>
+          <w:ilvl w:val="0"/>
+          <w:numId w:val="1126"/>
+        </w:numPr>
+        <w:pStyle w:val="Compact"/>
+      </w:pPr>
+      <w:r>
+        <w:t xml:space="preserve">Production build: passed</w:t>
+      </w:r>
+    </w:p>
+    <w:p>
+      <w:pPr>
+        <w:numPr>
+          <w:ilvl w:val="0"/>
+          <w:numId w:val="1126"/>
+        </w:numPr>
+        <w:pStyle w:val="Compact"/>
+      </w:pPr>
+      <w:r>
+        <w:t xml:space="preserve">Endpoint visible in build output at</w:t>
+      </w:r>
+      <w:r>
+        <w:t xml:space="preserve"> </w:t>
+      </w:r>
+      <w:r>
+        <w:rPr>
+          <w:rStyle w:val="VerbatimChar"/>
+        </w:rPr>
+        <w:t xml:space="preserve">/api/study-loads/[id]/responses</w:t>
+      </w:r>
+    </w:p>
+    <w:bookmarkEnd w:id="196"/>
+    <w:bookmarkStart w:id="197" w:name="risks-follow-up"/>
+    <w:p>
+      <w:pPr>
+        <w:pStyle w:val="Heading3"/>
+      </w:pPr>
+      <w:r>
+        <w:t xml:space="preserve">Risks / follow-up</w:t>
+      </w:r>
+    </w:p>
+    <w:p>
+      <w:pPr>
+        <w:numPr>
+          <w:ilvl w:val="0"/>
+          <w:numId w:val="1127"/>
+        </w:numPr>
+        <w:pStyle w:val="Compact"/>
+      </w:pPr>
+      <w:r>
+        <w:t xml:space="preserve">Answer keys hardcoded in static registry — if content is corrected, old stored payloads retain the old key.</w:t>
+      </w:r>
+      <w:r>
+        <w:t xml:space="preserve"> </w:t>
+      </w:r>
+      <w:r>
+        <w:rPr>
+          <w:rStyle w:val="VerbatimChar"/>
+        </w:rPr>
+        <w:t xml:space="preserve">contentVersion</w:t>
+      </w:r>
+      <w:r>
+        <w:t xml:space="preserve"> </w:t>
+      </w:r>
+      <w:r>
+        <w:t xml:space="preserve">field mitigates this.</w:t>
+      </w:r>
+    </w:p>
+    <w:p>
+      <w:pPr>
+        <w:numPr>
+          <w:ilvl w:val="0"/>
+          <w:numId w:val="1127"/>
+        </w:numPr>
+        <w:pStyle w:val="Compact"/>
+      </w:pPr>
+      <w:r>
+        <w:t xml:space="preserve">Title-based content resolution remains the primary linkage. Future: move to content IDs when content goes to DB.</w:t>
+      </w:r>
+    </w:p>
+    <w:p>
+      <w:pPr>
+        <w:numPr>
+          <w:ilvl w:val="0"/>
+          <w:numId w:val="1127"/>
+        </w:numPr>
+        <w:pStyle w:val="Compact"/>
+      </w:pPr>
+      <w:r>
+        <w:t xml:space="preserve">TutoringSession must exist (created by</w:t>
+      </w:r>
+      <w:r>
+        <w:t xml:space="preserve"> </w:t>
+      </w:r>
+      <w:r>
+        <w:rPr>
+          <w:rStyle w:val="VerbatimChar"/>
+        </w:rPr>
+        <w:t xml:space="preserve">/start</w:t>
+      </w:r>
+      <w:r>
+        <w:t xml:space="preserve">) before answers can be submitted. No session auto-creation.</w:t>
+      </w:r>
+    </w:p>
+    <w:bookmarkEnd w:id="197"/>
+    <w:bookmarkStart w:id="198" w:name="next-possible-phase-10"/>
+    <w:p>
+      <w:pPr>
+        <w:pStyle w:val="Heading3"/>
+      </w:pPr>
+      <w:r>
+        <w:t xml:space="preserve">Next possible phase</w:t>
+      </w:r>
+    </w:p>
+    <w:p>
+      <w:pPr>
+        <w:numPr>
+          <w:ilvl w:val="0"/>
+          <w:numId w:val="1128"/>
+        </w:numPr>
+        <w:pStyle w:val="Compact"/>
+      </w:pPr>
+      <w:r>
+        <w:t xml:space="preserve">FL-UX-2C — Student answer capture UI (radio buttons on</w:t>
+      </w:r>
+      <w:r>
+        <w:t xml:space="preserve"> </w:t>
+      </w:r>
+      <w:r>
+        <w:rPr>
+          <w:rStyle w:val="VerbatimChar"/>
+        </w:rPr>
+        <w:t xml:space="preserve">/now/study-loads/[id]</w:t>
+      </w:r>
+      <w:r>
+        <w:t xml:space="preserve">)</w:t>
+      </w:r>
+    </w:p>
+    <w:bookmarkEnd w:id="198"/>
+    <w:bookmarkEnd w:id="199"/>
+    <w:bookmarkEnd w:id="200"/>
     <w:sectPr/>
   </w:body>
 </w:document>
@@ -27847,6 +29347,36 @@
     <w:abstractNumId w:val="991"/>
   </w:num>
   <w:num w:numId="1118">
+    <w:abstractNumId w:val="991"/>
+  </w:num>
+  <w:num w:numId="1119">
+    <w:abstractNumId w:val="991"/>
+  </w:num>
+  <w:num w:numId="1120">
+    <w:abstractNumId w:val="991"/>
+  </w:num>
+  <w:num w:numId="1121">
+    <w:abstractNumId w:val="991"/>
+  </w:num>
+  <w:num w:numId="1122">
+    <w:abstractNumId w:val="991"/>
+  </w:num>
+  <w:num w:numId="1123">
+    <w:abstractNumId w:val="991"/>
+  </w:num>
+  <w:num w:numId="1124">
+    <w:abstractNumId w:val="991"/>
+  </w:num>
+  <w:num w:numId="1125">
+    <w:abstractNumId w:val="991"/>
+  </w:num>
+  <w:num w:numId="1126">
+    <w:abstractNumId w:val="991"/>
+  </w:num>
+  <w:num w:numId="1127">
+    <w:abstractNumId w:val="991"/>
+  </w:num>
+  <w:num w:numId="1128">
     <w:abstractNumId w:val="991"/>
   </w:num>
 </w:numbering>

</xml_diff>